<commit_message>
Ajout des procédures en format PDF, vérification + ajout de nouveaux détails dans chaque procédure en expliquant davantage (manque une vérification de la part des autres membres du groupe) + légère MAJ du README
</commit_message>
<xml_diff>
--- a/Documents/Procedure/Procedure_Activation_Moteur_Recherche.docx
+++ b/Documents/Procedure/Procedure_Activation_Moteur_Recherche.docx
@@ -49,7 +49,7 @@
                     </pic:cNvPicPr>
                   </pic:nvPicPr>
                   <pic:blipFill>
-                    <a:blip r:embed="rId7" cstate="print">
+                    <a:blip r:embed="rId8" cstate="print">
                       <a:extLst>
                         <a:ext uri="{28A0092B-C50C-407E-A947-70E740481C1C}">
                           <a14:useLocalDpi xmlns:a14="http://schemas.microsoft.com/office/drawing/2010/main" val="0"/>
@@ -104,7 +104,13 @@
     <w:sdt>
       <w:sdtPr>
         <w:rPr>
-          <w:rFonts w:ascii="Poppins" w:hAnsi="Poppins" w:cs="Poppins"/>
+          <w:rFonts w:ascii="Poppins" w:eastAsiaTheme="minorHAnsi" w:hAnsi="Poppins" w:cs="Poppins"/>
+          <w:color w:val="112250"/>
+          <w:kern w:val="2"/>
+          <w:sz w:val="24"/>
+          <w:szCs w:val="24"/>
+          <w:lang w:eastAsia="en-US"/>
+          <w14:ligatures w14:val="standardContextual"/>
         </w:rPr>
         <w:id w:val="-2135547711"/>
         <w:docPartObj>
@@ -114,15 +120,8 @@
       </w:sdtPr>
       <w:sdtEndPr>
         <w:rPr>
-          <w:rFonts w:eastAsiaTheme="minorHAnsi"/>
           <w:b/>
           <w:bCs/>
-          <w:color w:val="112250"/>
-          <w:kern w:val="2"/>
-          <w:sz w:val="24"/>
-          <w:szCs w:val="24"/>
-          <w:lang w:eastAsia="en-US"/>
-          <w14:ligatures w14:val="standardContextual"/>
         </w:rPr>
       </w:sdtEndPr>
       <w:sdtContent>
@@ -153,9 +152,8 @@
             <w:tabs>
               <w:tab w:val="right" w:leader="dot" w:pos="9062"/>
             </w:tabs>
-            <w:jc w:val="both"/>
             <w:rPr>
-              <w:rFonts w:ascii="Poppins" w:eastAsiaTheme="minorEastAsia" w:hAnsi="Poppins" w:cs="Poppins"/>
+              <w:rFonts w:eastAsiaTheme="minorEastAsia"/>
               <w:noProof/>
               <w:color w:val="auto"/>
               <w:lang w:eastAsia="fr-FR"/>
@@ -179,7 +177,7 @@
             </w:rPr>
             <w:fldChar w:fldCharType="separate"/>
           </w:r>
-          <w:hyperlink w:anchor="_Toc223260741" w:history="1">
+          <w:hyperlink w:anchor="_Toc223463729" w:history="1">
             <w:r>
               <w:rPr>
                 <w:rStyle w:val="Lienhypertexte"/>
@@ -190,7 +188,6 @@
             </w:r>
             <w:r>
               <w:rPr>
-                <w:rFonts w:ascii="Poppins" w:hAnsi="Poppins" w:cs="Poppins"/>
                 <w:noProof/>
                 <w:webHidden/>
               </w:rPr>
@@ -198,7 +195,6 @@
             </w:r>
             <w:r>
               <w:rPr>
-                <w:rFonts w:ascii="Poppins" w:hAnsi="Poppins" w:cs="Poppins"/>
                 <w:noProof/>
                 <w:webHidden/>
               </w:rPr>
@@ -206,22 +202,19 @@
             </w:r>
             <w:r>
               <w:rPr>
-                <w:rFonts w:ascii="Poppins" w:hAnsi="Poppins" w:cs="Poppins"/>
                 <w:noProof/>
                 <w:webHidden/>
               </w:rPr>
-              <w:instrText xml:space="preserve"> PAGEREF _Toc223260741 \h </w:instrText>
-            </w:r>
-            <w:r>
-              <w:rPr>
-                <w:rFonts w:ascii="Poppins" w:hAnsi="Poppins" w:cs="Poppins"/>
+              <w:instrText xml:space="preserve"> PAGEREF _Toc223463729 \h </w:instrText>
+            </w:r>
+            <w:r>
+              <w:rPr>
                 <w:noProof/>
                 <w:webHidden/>
               </w:rPr>
             </w:r>
             <w:r>
               <w:rPr>
-                <w:rFonts w:ascii="Poppins" w:hAnsi="Poppins" w:cs="Poppins"/>
                 <w:noProof/>
                 <w:webHidden/>
               </w:rPr>
@@ -229,7 +222,6 @@
             </w:r>
             <w:r>
               <w:rPr>
-                <w:rFonts w:ascii="Poppins" w:hAnsi="Poppins" w:cs="Poppins"/>
                 <w:noProof/>
                 <w:webHidden/>
               </w:rPr>
@@ -237,7 +229,6 @@
             </w:r>
             <w:r>
               <w:rPr>
-                <w:rFonts w:ascii="Poppins" w:hAnsi="Poppins" w:cs="Poppins"/>
                 <w:noProof/>
                 <w:webHidden/>
               </w:rPr>
@@ -251,15 +242,14 @@
             <w:tabs>
               <w:tab w:val="right" w:leader="dot" w:pos="9062"/>
             </w:tabs>
-            <w:jc w:val="both"/>
             <w:rPr>
-              <w:rFonts w:ascii="Poppins" w:eastAsiaTheme="minorEastAsia" w:hAnsi="Poppins" w:cs="Poppins"/>
+              <w:rFonts w:eastAsiaTheme="minorEastAsia"/>
               <w:noProof/>
               <w:color w:val="auto"/>
               <w:lang w:eastAsia="fr-FR"/>
             </w:rPr>
           </w:pPr>
-          <w:hyperlink w:anchor="_Toc223260742" w:history="1">
+          <w:hyperlink w:anchor="_Toc223463730" w:history="1">
             <w:r>
               <w:rPr>
                 <w:rStyle w:val="Lienhypertexte"/>
@@ -270,7 +260,6 @@
             </w:r>
             <w:r>
               <w:rPr>
-                <w:rFonts w:ascii="Poppins" w:hAnsi="Poppins" w:cs="Poppins"/>
                 <w:noProof/>
                 <w:webHidden/>
               </w:rPr>
@@ -278,7 +267,6 @@
             </w:r>
             <w:r>
               <w:rPr>
-                <w:rFonts w:ascii="Poppins" w:hAnsi="Poppins" w:cs="Poppins"/>
                 <w:noProof/>
                 <w:webHidden/>
               </w:rPr>
@@ -286,22 +274,19 @@
             </w:r>
             <w:r>
               <w:rPr>
-                <w:rFonts w:ascii="Poppins" w:hAnsi="Poppins" w:cs="Poppins"/>
                 <w:noProof/>
                 <w:webHidden/>
               </w:rPr>
-              <w:instrText xml:space="preserve"> PAGEREF _Toc223260742 \h </w:instrText>
-            </w:r>
-            <w:r>
-              <w:rPr>
-                <w:rFonts w:ascii="Poppins" w:hAnsi="Poppins" w:cs="Poppins"/>
+              <w:instrText xml:space="preserve"> PAGEREF _Toc223463730 \h </w:instrText>
+            </w:r>
+            <w:r>
+              <w:rPr>
                 <w:noProof/>
                 <w:webHidden/>
               </w:rPr>
             </w:r>
             <w:r>
               <w:rPr>
-                <w:rFonts w:ascii="Poppins" w:hAnsi="Poppins" w:cs="Poppins"/>
                 <w:noProof/>
                 <w:webHidden/>
               </w:rPr>
@@ -309,7 +294,6 @@
             </w:r>
             <w:r>
               <w:rPr>
-                <w:rFonts w:ascii="Poppins" w:hAnsi="Poppins" w:cs="Poppins"/>
                 <w:noProof/>
                 <w:webHidden/>
               </w:rPr>
@@ -317,7 +301,6 @@
             </w:r>
             <w:r>
               <w:rPr>
-                <w:rFonts w:ascii="Poppins" w:hAnsi="Poppins" w:cs="Poppins"/>
                 <w:noProof/>
                 <w:webHidden/>
               </w:rPr>
@@ -331,13 +314,14 @@
             <w:tabs>
               <w:tab w:val="right" w:leader="dot" w:pos="9062"/>
             </w:tabs>
-            <w:jc w:val="both"/>
             <w:rPr>
-              <w:rFonts w:ascii="Poppins" w:hAnsi="Poppins" w:cs="Poppins"/>
+              <w:rFonts w:eastAsiaTheme="minorEastAsia"/>
               <w:noProof/>
+              <w:color w:val="auto"/>
+              <w:lang w:eastAsia="fr-FR"/>
             </w:rPr>
           </w:pPr>
-          <w:hyperlink w:anchor="_Toc223260743" w:history="1">
+          <w:hyperlink w:anchor="_Toc223463731" w:history="1">
             <w:r>
               <w:rPr>
                 <w:rStyle w:val="Lienhypertexte"/>
@@ -348,7 +332,6 @@
             </w:r>
             <w:r>
               <w:rPr>
-                <w:rFonts w:ascii="Poppins" w:hAnsi="Poppins" w:cs="Poppins"/>
                 <w:noProof/>
                 <w:webHidden/>
               </w:rPr>
@@ -356,7 +339,6 @@
             </w:r>
             <w:r>
               <w:rPr>
-                <w:rFonts w:ascii="Poppins" w:hAnsi="Poppins" w:cs="Poppins"/>
                 <w:noProof/>
                 <w:webHidden/>
               </w:rPr>
@@ -364,22 +346,19 @@
             </w:r>
             <w:r>
               <w:rPr>
-                <w:rFonts w:ascii="Poppins" w:hAnsi="Poppins" w:cs="Poppins"/>
                 <w:noProof/>
                 <w:webHidden/>
               </w:rPr>
-              <w:instrText xml:space="preserve"> PAGEREF _Toc223260743 \h </w:instrText>
-            </w:r>
-            <w:r>
-              <w:rPr>
-                <w:rFonts w:ascii="Poppins" w:hAnsi="Poppins" w:cs="Poppins"/>
+              <w:instrText xml:space="preserve"> PAGEREF _Toc223463731 \h </w:instrText>
+            </w:r>
+            <w:r>
+              <w:rPr>
                 <w:noProof/>
                 <w:webHidden/>
               </w:rPr>
             </w:r>
             <w:r>
               <w:rPr>
-                <w:rFonts w:ascii="Poppins" w:hAnsi="Poppins" w:cs="Poppins"/>
                 <w:noProof/>
                 <w:webHidden/>
               </w:rPr>
@@ -387,15 +366,13 @@
             </w:r>
             <w:r>
               <w:rPr>
-                <w:rFonts w:ascii="Poppins" w:hAnsi="Poppins" w:cs="Poppins"/>
                 <w:noProof/>
                 <w:webHidden/>
               </w:rPr>
-              <w:t>6</w:t>
-            </w:r>
-            <w:r>
-              <w:rPr>
-                <w:rFonts w:ascii="Poppins" w:hAnsi="Poppins" w:cs="Poppins"/>
+              <w:t>7</w:t>
+            </w:r>
+            <w:r>
+              <w:rPr>
                 <w:noProof/>
                 <w:webHidden/>
               </w:rPr>
@@ -429,7 +406,7 @@
           <w:rFonts w:ascii="Poppins" w:hAnsi="Poppins" w:cs="Poppins"/>
         </w:rPr>
       </w:pPr>
-      <w:bookmarkStart w:id="0" w:name="_Toc223260741"/>
+      <w:bookmarkStart w:id="0" w:name="_Toc223463729"/>
       <w:r>
         <w:rPr>
           <w:rFonts w:ascii="Poppins" w:hAnsi="Poppins" w:cs="Poppins"/>
@@ -457,12 +434,24 @@
         <w:rPr>
           <w:rFonts w:ascii="Poppins" w:hAnsi="Poppins" w:cs="Poppins"/>
         </w:rPr>
-        <w:t>Dans cette procédure vous allez pouvoir lancer le moteur recherche sur notre application. En effet, lorsque que vous allez essayer d’accéder à la page « Acheter » sur notre site d’enchère, vous allez être confronté à une erreur comme celle-ci-dessous.</w:t>
-      </w:r>
-    </w:p>
-    <w:p>
-      <w:pPr>
-        <w:jc w:val="both"/>
+        <w:t>Dans cette procédure vous allez pouvoir lancer le moteur recherche sur notre application. En effet, lorsque que vous allez essayer d’accéder à la page « Acheter » sur notre site d’enchère, vous allez être confronté à une erreur comme celle</w:t>
+      </w:r>
+      <w:r>
+        <w:rPr>
+          <w:rFonts w:ascii="Poppins" w:hAnsi="Poppins" w:cs="Poppins"/>
+        </w:rPr>
+        <w:t xml:space="preserve"> </w:t>
+      </w:r>
+      <w:r>
+        <w:rPr>
+          <w:rFonts w:ascii="Poppins" w:hAnsi="Poppins" w:cs="Poppins"/>
+        </w:rPr>
+        <w:t>ci-dessous.</w:t>
+      </w:r>
+    </w:p>
+    <w:p>
+      <w:pPr>
+        <w:jc w:val="center"/>
         <w:rPr>
           <w:rFonts w:ascii="Poppins" w:hAnsi="Poppins" w:cs="Poppins"/>
         </w:rPr>
@@ -489,7 +478,7 @@
                     <pic:cNvPicPr/>
                   </pic:nvPicPr>
                   <pic:blipFill>
-                    <a:blip r:embed="rId8"/>
+                    <a:blip r:embed="rId9"/>
                     <a:stretch>
                       <a:fillRect/>
                     </a:stretch>
@@ -527,7 +516,7 @@
         </w:rPr>
       </w:pPr>
       <w:bookmarkStart w:id="1" w:name="_Activation"/>
-      <w:bookmarkStart w:id="2" w:name="_Toc223260742"/>
+      <w:bookmarkStart w:id="2" w:name="_Toc223463730"/>
       <w:bookmarkEnd w:id="1"/>
       <w:r>
         <w:rPr>
@@ -537,6 +526,7 @@
       </w:r>
       <w:bookmarkEnd w:id="2"/>
     </w:p>
+    <w:p/>
     <w:p>
       <w:pPr>
         <w:jc w:val="both"/>
@@ -554,21 +544,7 @@
         <w:rPr>
           <w:rFonts w:ascii="Poppins" w:hAnsi="Poppins" w:cs="Poppins"/>
         </w:rPr>
-        <w:t xml:space="preserve"> correspondant à l’API utilité nommé </w:t>
-      </w:r>
-      <w:proofErr w:type="spellStart"/>
-      <w:r>
-        <w:rPr>
-          <w:rFonts w:ascii="Poppins" w:hAnsi="Poppins" w:cs="Poppins"/>
-        </w:rPr>
-        <w:t>Meilisearch</w:t>
-      </w:r>
-      <w:proofErr w:type="spellEnd"/>
-      <w:r>
-        <w:rPr>
-          <w:rFonts w:ascii="Poppins" w:hAnsi="Poppins" w:cs="Poppins"/>
-        </w:rPr>
-        <w:t>.</w:t>
+        <w:t xml:space="preserve"> correspondant à l’API utilité nommé Meilisearch.</w:t>
       </w:r>
       <w:r>
         <w:rPr>
@@ -612,37 +588,7 @@
         <w:rPr>
           <w:rFonts w:ascii="Poppins" w:hAnsi="Poppins" w:cs="Poppins"/>
         </w:rPr>
-        <w:t xml:space="preserve"> </w:t>
-      </w:r>
-      <w:r>
-        <w:rPr>
-          <w:rFonts w:ascii="Poppins" w:hAnsi="Poppins" w:cs="Poppins"/>
-        </w:rPr>
-        <w:t xml:space="preserve">(vous pouvez donc installer la dernière version et installer </w:t>
-      </w:r>
-      <w:r>
-        <w:rPr>
-          <w:rFonts w:ascii="Poppins" w:hAnsi="Poppins" w:cs="Poppins"/>
-        </w:rPr>
-        <w:t>une version antérieure</w:t>
-      </w:r>
-      <w:r>
-        <w:rPr>
-          <w:rFonts w:ascii="Poppins" w:hAnsi="Poppins" w:cs="Poppins"/>
-        </w:rPr>
-        <w:t xml:space="preserve"> si </w:t>
-      </w:r>
-      <w:r>
-        <w:rPr>
-          <w:rFonts w:ascii="Poppins" w:hAnsi="Poppins" w:cs="Poppins"/>
-        </w:rPr>
-        <w:t>celle-là</w:t>
-      </w:r>
-      <w:r>
-        <w:rPr>
-          <w:rFonts w:ascii="Poppins" w:hAnsi="Poppins" w:cs="Poppins"/>
-        </w:rPr>
-        <w:t xml:space="preserve"> n’est plus compatible avec notre projet)</w:t>
+        <w:t xml:space="preserve"> compris.</w:t>
       </w:r>
     </w:p>
     <w:p>
@@ -664,7 +610,7 @@
         </w:rPr>
         <w:t xml:space="preserve"> via le lien suivant : </w:t>
       </w:r>
-      <w:hyperlink r:id="rId9" w:history="1">
+      <w:hyperlink r:id="rId10" w:history="1">
         <w:r>
           <w:rPr>
             <w:rStyle w:val="Lienhypertexte"/>
@@ -717,7 +663,7 @@
                     <pic:cNvPicPr/>
                   </pic:nvPicPr>
                   <pic:blipFill>
-                    <a:blip r:embed="rId10"/>
+                    <a:blip r:embed="rId11"/>
                     <a:stretch>
                       <a:fillRect/>
                     </a:stretch>
@@ -761,7 +707,19 @@
         <w:rPr>
           <w:rFonts w:ascii="Poppins" w:hAnsi="Poppins" w:cs="Poppins"/>
         </w:rPr>
-        <w:t xml:space="preserve"> qu’il est possible d’installer.</w:t>
+        <w:t xml:space="preserve"> qu’il est possible d’installer</w:t>
+      </w:r>
+      <w:r>
+        <w:rPr>
+          <w:rFonts w:ascii="Poppins" w:hAnsi="Poppins" w:cs="Poppins"/>
+        </w:rPr>
+        <w:t xml:space="preserve"> sur la dernière version</w:t>
+      </w:r>
+      <w:r>
+        <w:rPr>
+          <w:rFonts w:ascii="Poppins" w:hAnsi="Poppins" w:cs="Poppins"/>
+        </w:rPr>
+        <w:t>.</w:t>
       </w:r>
     </w:p>
     <w:p>
@@ -792,7 +750,7 @@
                     <pic:cNvPicPr/>
                   </pic:nvPicPr>
                   <pic:blipFill>
-                    <a:blip r:embed="rId11"/>
+                    <a:blip r:embed="rId12"/>
                     <a:stretch>
                       <a:fillRect/>
                     </a:stretch>
@@ -841,6 +799,12 @@
       <w:r>
         <w:rPr>
           <w:rFonts w:ascii="Poppins" w:hAnsi="Poppins" w:cs="Poppins"/>
+        </w:rPr>
+        <w:t>.</w:t>
+      </w:r>
+      <w:r>
+        <w:rPr>
+          <w:rFonts w:ascii="Poppins" w:hAnsi="Poppins" w:cs="Poppins"/>
           <w:noProof/>
         </w:rPr>
         <w:drawing>
@@ -859,7 +823,7 @@
                     <pic:cNvPicPr/>
                   </pic:nvPicPr>
                   <pic:blipFill>
-                    <a:blip r:embed="rId12"/>
+                    <a:blip r:embed="rId13"/>
                     <a:stretch>
                       <a:fillRect/>
                     </a:stretch>
@@ -892,8 +856,22 @@
           <w:rFonts w:ascii="Poppins" w:hAnsi="Poppins" w:cs="Poppins"/>
         </w:rPr>
         <w:lastRenderedPageBreak/>
-        <w:t xml:space="preserve">Puis cliquez sur le fichier </w:t>
-      </w:r>
+        <w:t>Puis cliquez sur le fich</w:t>
+      </w:r>
+      <w:r>
+        <w:rPr>
+          <w:rFonts w:ascii="Poppins" w:hAnsi="Poppins" w:cs="Poppins"/>
+        </w:rPr>
+        <w:t>ier en .exe correspondant à votre système d’exploitation, dans notre cas ce sera sur Windows.</w:t>
+      </w:r>
+    </w:p>
+    <w:p>
+      <w:pPr>
+        <w:jc w:val="center"/>
+        <w:rPr>
+          <w:rFonts w:ascii="Poppins" w:hAnsi="Poppins" w:cs="Poppins"/>
+        </w:rPr>
+      </w:pPr>
       <w:r>
         <w:rPr>
           <w:rFonts w:ascii="Poppins" w:hAnsi="Poppins" w:cs="Poppins"/>
@@ -915,7 +893,7 @@
                     <pic:cNvPicPr/>
                   </pic:nvPicPr>
                   <pic:blipFill>
-                    <a:blip r:embed="rId13"/>
+                    <a:blip r:embed="rId14"/>
                     <a:stretch>
                       <a:fillRect/>
                     </a:stretch>
@@ -949,14 +927,12 @@
         </w:rPr>
         <w:t xml:space="preserve">Vous devriez apercevoir une alerte avant le téléchargement </w:t>
       </w:r>
-      <w:proofErr w:type="spellStart"/>
-      <w:r>
-        <w:rPr>
-          <w:rFonts w:ascii="Poppins" w:hAnsi="Poppins" w:cs="Poppins"/>
-        </w:rPr>
-        <w:t>compelt</w:t>
-      </w:r>
-      <w:proofErr w:type="spellEnd"/>
+      <w:r>
+        <w:rPr>
+          <w:rFonts w:ascii="Poppins" w:hAnsi="Poppins" w:cs="Poppins"/>
+        </w:rPr>
+        <w:t>complet</w:t>
+      </w:r>
       <w:r>
         <w:rPr>
           <w:rFonts w:ascii="Poppins" w:hAnsi="Poppins" w:cs="Poppins"/>
@@ -966,7 +942,7 @@
     </w:p>
     <w:p>
       <w:pPr>
-        <w:jc w:val="both"/>
+        <w:jc w:val="center"/>
         <w:rPr>
           <w:rFonts w:ascii="Poppins" w:hAnsi="Poppins" w:cs="Poppins"/>
         </w:rPr>
@@ -992,7 +968,7 @@
                     <pic:cNvPicPr/>
                   </pic:nvPicPr>
                   <pic:blipFill>
-                    <a:blip r:embed="rId14"/>
+                    <a:blip r:embed="rId15"/>
                     <a:stretch>
                       <a:fillRect/>
                     </a:stretch>
@@ -1029,7 +1005,7 @@
     </w:p>
     <w:p>
       <w:pPr>
-        <w:jc w:val="both"/>
+        <w:jc w:val="center"/>
         <w:rPr>
           <w:rFonts w:ascii="Poppins" w:hAnsi="Poppins" w:cs="Poppins"/>
         </w:rPr>
@@ -1055,7 +1031,7 @@
                     <pic:cNvPicPr/>
                   </pic:nvPicPr>
                   <pic:blipFill>
-                    <a:blip r:embed="rId15"/>
+                    <a:blip r:embed="rId16"/>
                     <a:stretch>
                       <a:fillRect/>
                     </a:stretch>
@@ -1087,12 +1063,30 @@
         <w:rPr>
           <w:rFonts w:ascii="Poppins" w:hAnsi="Poppins" w:cs="Poppins"/>
         </w:rPr>
-        <w:t>Une nouvelle interface va apparaître et vous allez faire la même chose, c’est-à-dire cliquer sur les points de suspension et cliquer sur « Conserver quand même »</w:t>
-      </w:r>
-    </w:p>
-    <w:p>
-      <w:pPr>
-        <w:jc w:val="both"/>
+        <w:t>Une nouvelle interface va apparaître et vous allez faire la même chose</w:t>
+      </w:r>
+      <w:r>
+        <w:rPr>
+          <w:rFonts w:ascii="Poppins" w:hAnsi="Poppins" w:cs="Poppins"/>
+        </w:rPr>
+        <w:t xml:space="preserve"> que précédemment</w:t>
+      </w:r>
+      <w:r>
+        <w:rPr>
+          <w:rFonts w:ascii="Poppins" w:hAnsi="Poppins" w:cs="Poppins"/>
+        </w:rPr>
+        <w:t>, c’est-à-dire cliquer sur les points de suspension et cliquer sur « Conserver quand même »</w:t>
+      </w:r>
+      <w:r>
+        <w:rPr>
+          <w:rFonts w:ascii="Poppins" w:hAnsi="Poppins" w:cs="Poppins"/>
+        </w:rPr>
+        <w:t>.</w:t>
+      </w:r>
+    </w:p>
+    <w:p>
+      <w:pPr>
+        <w:jc w:val="center"/>
         <w:rPr>
           <w:rFonts w:ascii="Poppins" w:hAnsi="Poppins" w:cs="Poppins"/>
         </w:rPr>
@@ -1119,7 +1113,7 @@
                     <pic:cNvPicPr/>
                   </pic:nvPicPr>
                   <pic:blipFill>
-                    <a:blip r:embed="rId16"/>
+                    <a:blip r:embed="rId17"/>
                     <a:stretch>
                       <a:fillRect/>
                     </a:stretch>
@@ -1164,7 +1158,7 @@
     </w:p>
     <w:p>
       <w:pPr>
-        <w:jc w:val="both"/>
+        <w:jc w:val="center"/>
         <w:rPr>
           <w:rFonts w:ascii="Poppins" w:hAnsi="Poppins" w:cs="Poppins"/>
         </w:rPr>
@@ -1190,7 +1184,7 @@
                     <pic:cNvPicPr/>
                   </pic:nvPicPr>
                   <pic:blipFill>
-                    <a:blip r:embed="rId17"/>
+                    <a:blip r:embed="rId18"/>
                     <a:stretch>
                       <a:fillRect/>
                     </a:stretch>
@@ -1248,7 +1242,19 @@
         <w:rPr>
           <w:rFonts w:ascii="Poppins" w:hAnsi="Poppins" w:cs="Poppins"/>
         </w:rPr>
-        <w:t>Pour ce faire il faut cliquer dans l’espace vide du dossier, c’est-à-dire sur aucun fichier, et cliquez sur « </w:t>
+        <w:t xml:space="preserve">Pour ce faire il faut </w:t>
+      </w:r>
+      <w:r>
+        <w:rPr>
+          <w:rFonts w:ascii="Poppins" w:hAnsi="Poppins" w:cs="Poppins"/>
+        </w:rPr>
+        <w:t>faire un clic droit</w:t>
+      </w:r>
+      <w:r>
+        <w:rPr>
+          <w:rFonts w:ascii="Poppins" w:hAnsi="Poppins" w:cs="Poppins"/>
+        </w:rPr>
+        <w:t xml:space="preserve"> dans l’espace vide du dossier, c’est-à-dire sur aucun fichier, et cliquez sur « </w:t>
       </w:r>
       <w:r>
         <w:rPr>
@@ -1265,7 +1271,7 @@
     </w:p>
     <w:p>
       <w:pPr>
-        <w:jc w:val="both"/>
+        <w:jc w:val="center"/>
         <w:rPr>
           <w:rFonts w:ascii="Poppins" w:hAnsi="Poppins" w:cs="Poppins"/>
         </w:rPr>
@@ -1291,7 +1297,7 @@
                     <pic:cNvPicPr/>
                   </pic:nvPicPr>
                   <pic:blipFill>
-                    <a:blip r:embed="rId18"/>
+                    <a:blip r:embed="rId19"/>
                     <a:stretch>
                       <a:fillRect/>
                     </a:stretch>
@@ -1314,7 +1320,7 @@
     </w:p>
     <w:p>
       <w:pPr>
-        <w:jc w:val="both"/>
+        <w:jc w:val="center"/>
         <w:rPr>
           <w:rFonts w:ascii="Poppins" w:hAnsi="Poppins" w:cs="Poppins"/>
         </w:rPr>
@@ -1341,7 +1347,7 @@
                     <pic:cNvPicPr/>
                   </pic:nvPicPr>
                   <pic:blipFill>
-                    <a:blip r:embed="rId19"/>
+                    <a:blip r:embed="rId20"/>
                     <a:stretch>
                       <a:fillRect/>
                     </a:stretch>
@@ -1375,9 +1381,23 @@
         </w:rPr>
         <w:t xml:space="preserve">Tapez la commande suivante : </w:t>
       </w:r>
-      <w:r>
-        <w:rPr>
-          <w:rFonts w:ascii="Poppins" w:hAnsi="Poppins" w:cs="Poppins"/>
+    </w:p>
+    <w:p>
+      <w:pPr>
+        <w:jc w:val="both"/>
+        <w:rPr>
+          <w:rFonts w:ascii="Poppins" w:hAnsi="Poppins" w:cs="Poppins"/>
+          <w:b/>
+          <w:bCs/>
+          <w:lang w:val="en-US"/>
+        </w:rPr>
+      </w:pPr>
+      <w:r>
+        <w:rPr>
+          <w:rFonts w:ascii="Poppins" w:hAnsi="Poppins" w:cs="Poppins"/>
+          <w:b/>
+          <w:bCs/>
+          <w:lang w:val="en-US"/>
         </w:rPr>
         <w:t>.\meilisearch-windows-amd64.exe --master-key CLE_TEST_SAE_SITE</w:t>
       </w:r>
@@ -1410,7 +1430,7 @@
                     <pic:cNvPicPr/>
                   </pic:nvPicPr>
                   <pic:blipFill>
-                    <a:blip r:embed="rId20"/>
+                    <a:blip r:embed="rId21"/>
                     <a:stretch>
                       <a:fillRect/>
                     </a:stretch>
@@ -1459,7 +1479,7 @@
                     <pic:cNvPicPr/>
                   </pic:nvPicPr>
                   <pic:blipFill>
-                    <a:blip r:embed="rId21"/>
+                    <a:blip r:embed="rId22"/>
                     <a:stretch>
                       <a:fillRect/>
                     </a:stretch>
@@ -1489,53 +1509,304 @@
       </w:pPr>
       <w:r>
         <w:rPr>
-          <w:rFonts w:ascii="Poppins" w:hAnsi="Poppins" w:cs="Poppins"/>
-        </w:rPr>
-        <w:t xml:space="preserve">Attention : il ne faut pas fermer le terminal, laissez-le en arrière-plan et retourner sur notre application via le lien suivant : </w:t>
-      </w:r>
-      <w:r>
-        <w:rPr>
-          <w:rFonts w:ascii="Poppins" w:hAnsi="Poppins" w:cs="Poppins"/>
-        </w:rPr>
-        <w:t>« localhost/</w:t>
-      </w:r>
-      <w:proofErr w:type="spellStart"/>
-      <w:r>
-        <w:rPr>
-          <w:rFonts w:ascii="Poppins" w:hAnsi="Poppins" w:cs="Poppins"/>
-        </w:rPr>
-        <w:t>SAE_Site_Enchere</w:t>
-      </w:r>
-      <w:proofErr w:type="spellEnd"/>
-      <w:r>
-        <w:rPr>
-          <w:rFonts w:ascii="Poppins" w:hAnsi="Poppins" w:cs="Poppins"/>
-        </w:rPr>
-        <w:t>-main/</w:t>
-      </w:r>
-      <w:proofErr w:type="spellStart"/>
-      <w:r>
-        <w:rPr>
-          <w:rFonts w:ascii="Poppins" w:hAnsi="Poppins" w:cs="Poppins"/>
-        </w:rPr>
-        <w:t>newMVC</w:t>
-      </w:r>
-      <w:proofErr w:type="spellEnd"/>
-      <w:r>
-        <w:rPr>
-          <w:rFonts w:ascii="Poppins" w:hAnsi="Poppins" w:cs="Poppins"/>
-        </w:rPr>
-        <w:t xml:space="preserve"> » depuis votre navigateur ou en cliquant sur le lien suivant : </w:t>
-      </w:r>
-      <w:hyperlink r:id="rId22" w:history="1">
-        <w:r>
-          <w:rPr>
-            <w:rStyle w:val="Lienhypertexte"/>
-            <w:rFonts w:ascii="Poppins" w:hAnsi="Poppins" w:cs="Poppins"/>
-          </w:rPr>
-          <w:t>Page d'accueil</w:t>
-        </w:r>
-      </w:hyperlink>
+          <w:noProof/>
+          <w:lang w:eastAsia="fr-FR"/>
+        </w:rPr>
+        <w:lastRenderedPageBreak/>
+        <mc:AlternateContent>
+          <mc:Choice Requires="wps">
+            <w:drawing>
+              <wp:anchor distT="0" distB="0" distL="114300" distR="114300" simplePos="0" relativeHeight="251661312" behindDoc="1" locked="0" layoutInCell="1" allowOverlap="1" wp14:anchorId="0B07DA09" wp14:editId="6A6DCCAC">
+                <wp:simplePos x="0" y="0"/>
+                <wp:positionH relativeFrom="margin">
+                  <wp:align>center</wp:align>
+                </wp:positionH>
+                <wp:positionV relativeFrom="paragraph">
+                  <wp:posOffset>0</wp:posOffset>
+                </wp:positionV>
+                <wp:extent cx="6838950" cy="2313305"/>
+                <wp:effectExtent l="0" t="0" r="19050" b="10795"/>
+                <wp:wrapSquare wrapText="bothSides"/>
+                <wp:docPr id="1360104477" name="Rectangle 5"/>
+                <wp:cNvGraphicFramePr/>
+                <a:graphic xmlns:a="http://schemas.openxmlformats.org/drawingml/2006/main">
+                  <a:graphicData uri="http://schemas.microsoft.com/office/word/2010/wordprocessingShape">
+                    <wps:wsp>
+                      <wps:cNvSpPr/>
+                      <wps:spPr>
+                        <a:xfrm>
+                          <a:off x="0" y="0"/>
+                          <a:ext cx="6838950" cy="2313305"/>
+                        </a:xfrm>
+                        <a:prstGeom prst="rect">
+                          <a:avLst/>
+                        </a:prstGeom>
+                        <a:noFill/>
+                        <a:ln>
+                          <a:solidFill>
+                            <a:srgbClr val="C00000"/>
+                          </a:solidFill>
+                        </a:ln>
+                      </wps:spPr>
+                      <wps:style>
+                        <a:lnRef idx="2">
+                          <a:schemeClr val="accent1">
+                            <a:shade val="15000"/>
+                          </a:schemeClr>
+                        </a:lnRef>
+                        <a:fillRef idx="1">
+                          <a:schemeClr val="accent1"/>
+                        </a:fillRef>
+                        <a:effectRef idx="0">
+                          <a:schemeClr val="accent1"/>
+                        </a:effectRef>
+                        <a:fontRef idx="minor">
+                          <a:schemeClr val="lt1"/>
+                        </a:fontRef>
+                      </wps:style>
+                      <wps:txbx>
+                        <w:txbxContent>
+                          <w:p>
+                            <w:pPr>
+                              <w:jc w:val="center"/>
+                              <w:rPr>
+                                <w:rFonts w:ascii="Poppins" w:hAnsi="Poppins" w:cs="Poppins"/>
+                                <w:b/>
+                                <w:bCs/>
+                                <w:color w:val="EE0000"/>
+                                <w:sz w:val="44"/>
+                                <w:szCs w:val="44"/>
+                              </w:rPr>
+                            </w:pPr>
+                            <w:r>
+                              <w:rPr>
+                                <w:rFonts w:ascii="Poppins" w:hAnsi="Poppins" w:cs="Poppins"/>
+                                <w:b/>
+                                <w:bCs/>
+                                <w:color w:val="EE0000"/>
+                                <w:sz w:val="44"/>
+                                <w:szCs w:val="44"/>
+                              </w:rPr>
+                              <w:t>Attention</w:t>
+                            </w:r>
+                          </w:p>
+                          <w:p>
+                            <w:pPr>
+                              <w:jc w:val="center"/>
+                            </w:pPr>
+                            <w:r>
+                              <w:rPr>
+                                <w:rFonts w:ascii="Poppins" w:hAnsi="Poppins" w:cs="Poppins"/>
+                                <w:u w:val="single"/>
+                              </w:rPr>
+                              <w:t>I</w:t>
+                            </w:r>
+                            <w:r>
+                              <w:rPr>
+                                <w:rFonts w:ascii="Poppins" w:hAnsi="Poppins" w:cs="Poppins"/>
+                                <w:u w:val="single"/>
+                              </w:rPr>
+                              <w:t>l ne faut pas fermer le terminal</w:t>
+                            </w:r>
+                            <w:r>
+                              <w:rPr>
+                                <w:rFonts w:ascii="Poppins" w:hAnsi="Poppins" w:cs="Poppins"/>
+                              </w:rPr>
+                              <w:t xml:space="preserve">, laissez-le en arrière-plan et retourner sur notre application via le lien suivant : « localhost/SAE_Site_Enchere-main/newMVC » depuis votre navigateur ou en cliquant sur le lien suivant : </w:t>
+                            </w:r>
+                            <w:hyperlink r:id="rId23" w:history="1">
+                              <w:r>
+                                <w:rPr>
+                                  <w:rStyle w:val="Lienhypertexte"/>
+                                  <w:rFonts w:ascii="Poppins" w:hAnsi="Poppins" w:cs="Poppins"/>
+                                </w:rPr>
+                                <w:t>Page d'accueil</w:t>
+                              </w:r>
+                            </w:hyperlink>
+                          </w:p>
+                          <w:p>
+                            <w:pPr>
+                              <w:jc w:val="center"/>
+                            </w:pPr>
+                            <w:r>
+                              <w:rPr>
+                                <w:rFonts w:ascii="Poppins" w:hAnsi="Poppins" w:cs="Poppins"/>
+                                <w:noProof/>
+                              </w:rPr>
+                              <w:drawing>
+                                <wp:inline distT="0" distB="0" distL="0" distR="0" wp14:anchorId="42D607F9" wp14:editId="27FCBC1E">
+                                  <wp:extent cx="5760720" cy="445135"/>
+                                  <wp:effectExtent l="0" t="0" r="0" b="0"/>
+                                  <wp:docPr id="1355115818" name="Image 1"/>
+                                  <wp:cNvGraphicFramePr>
+                                    <a:graphicFrameLocks xmlns:a="http://schemas.openxmlformats.org/drawingml/2006/main" noChangeAspect="1"/>
+                                  </wp:cNvGraphicFramePr>
+                                  <a:graphic xmlns:a="http://schemas.openxmlformats.org/drawingml/2006/main">
+                                    <a:graphicData uri="http://schemas.openxmlformats.org/drawingml/2006/picture">
+                                      <pic:pic xmlns:pic="http://schemas.openxmlformats.org/drawingml/2006/picture">
+                                        <pic:nvPicPr>
+                                          <pic:cNvPr id="480231220" name=""/>
+                                          <pic:cNvPicPr/>
+                                        </pic:nvPicPr>
+                                        <pic:blipFill>
+                                          <a:blip r:embed="rId24"/>
+                                          <a:stretch>
+                                            <a:fillRect/>
+                                          </a:stretch>
+                                        </pic:blipFill>
+                                        <pic:spPr>
+                                          <a:xfrm>
+                                            <a:off x="0" y="0"/>
+                                            <a:ext cx="5760720" cy="445135"/>
+                                          </a:xfrm>
+                                          <a:prstGeom prst="rect">
+                                            <a:avLst/>
+                                          </a:prstGeom>
+                                        </pic:spPr>
+                                      </pic:pic>
+                                    </a:graphicData>
+                                  </a:graphic>
+                                </wp:inline>
+                              </w:drawing>
+                            </w:r>
+                          </w:p>
+                        </w:txbxContent>
+                      </wps:txbx>
+                      <wps:bodyPr rot="0" spcFirstLastPara="0" vertOverflow="clip" horzOverflow="clip" vert="horz" wrap="square" lIns="91440" tIns="45720" rIns="91440" bIns="45720" numCol="1" spcCol="0" rtlCol="0" fromWordArt="0" anchor="ctr" anchorCtr="0" forceAA="0" compatLnSpc="1">
+                        <a:prstTxWarp prst="textNoShape">
+                          <a:avLst/>
+                        </a:prstTxWarp>
+                        <a:noAutofit/>
+                      </wps:bodyPr>
+                    </wps:wsp>
+                  </a:graphicData>
+                </a:graphic>
+                <wp14:sizeRelH relativeFrom="page">
+                  <wp14:pctWidth>0</wp14:pctWidth>
+                </wp14:sizeRelH>
+                <wp14:sizeRelV relativeFrom="margin">
+                  <wp14:pctHeight>0</wp14:pctHeight>
+                </wp14:sizeRelV>
+              </wp:anchor>
+            </w:drawing>
+          </mc:Choice>
+          <mc:Fallback>
+            <w:pict>
+              <v:rect w14:anchorId="0B07DA09" id="Rectangle 5" o:spid="_x0000_s1026" style="position:absolute;left:0;text-align:left;margin-left:0;margin-top:0;width:538.5pt;height:182.15pt;z-index:-251655168;visibility:visible;mso-wrap-style:square;mso-width-percent:0;mso-height-percent:0;mso-wrap-distance-left:9pt;mso-wrap-distance-top:0;mso-wrap-distance-right:9pt;mso-wrap-distance-bottom:0;mso-position-horizontal:center;mso-position-horizontal-relative:margin;mso-position-vertical:absolute;mso-position-vertical-relative:text;mso-width-percent:0;mso-height-percent:0;mso-width-relative:page;mso-height-relative:margin;v-text-anchor:middle" o:gfxdata="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" filled="f" strokecolor="#c00000" strokeweight="1pt">
+                <v:textbox>
+                  <w:txbxContent>
+                    <w:p>
+                      <w:pPr>
+                        <w:jc w:val="center"/>
+                        <w:rPr>
+                          <w:rFonts w:ascii="Poppins" w:hAnsi="Poppins" w:cs="Poppins"/>
+                          <w:b/>
+                          <w:bCs/>
+                          <w:color w:val="EE0000"/>
+                          <w:sz w:val="44"/>
+                          <w:szCs w:val="44"/>
+                        </w:rPr>
+                      </w:pPr>
+                      <w:r>
+                        <w:rPr>
+                          <w:rFonts w:ascii="Poppins" w:hAnsi="Poppins" w:cs="Poppins"/>
+                          <w:b/>
+                          <w:bCs/>
+                          <w:color w:val="EE0000"/>
+                          <w:sz w:val="44"/>
+                          <w:szCs w:val="44"/>
+                        </w:rPr>
+                        <w:t>Attention</w:t>
+                      </w:r>
+                    </w:p>
+                    <w:p>
+                      <w:pPr>
+                        <w:jc w:val="center"/>
+                      </w:pPr>
+                      <w:r>
+                        <w:rPr>
+                          <w:rFonts w:ascii="Poppins" w:hAnsi="Poppins" w:cs="Poppins"/>
+                          <w:u w:val="single"/>
+                        </w:rPr>
+                        <w:t>I</w:t>
+                      </w:r>
+                      <w:r>
+                        <w:rPr>
+                          <w:rFonts w:ascii="Poppins" w:hAnsi="Poppins" w:cs="Poppins"/>
+                          <w:u w:val="single"/>
+                        </w:rPr>
+                        <w:t>l ne faut pas fermer le terminal</w:t>
+                      </w:r>
+                      <w:r>
+                        <w:rPr>
+                          <w:rFonts w:ascii="Poppins" w:hAnsi="Poppins" w:cs="Poppins"/>
+                        </w:rPr>
+                        <w:t xml:space="preserve">, laissez-le en arrière-plan et retourner sur notre application via le lien suivant : « localhost/SAE_Site_Enchere-main/newMVC » depuis votre navigateur ou en cliquant sur le lien suivant : </w:t>
+                      </w:r>
+                      <w:hyperlink r:id="rId25" w:history="1">
+                        <w:r>
+                          <w:rPr>
+                            <w:rStyle w:val="Lienhypertexte"/>
+                            <w:rFonts w:ascii="Poppins" w:hAnsi="Poppins" w:cs="Poppins"/>
+                          </w:rPr>
+                          <w:t>Page d'accueil</w:t>
+                        </w:r>
+                      </w:hyperlink>
+                    </w:p>
+                    <w:p>
+                      <w:pPr>
+                        <w:jc w:val="center"/>
+                      </w:pPr>
+                      <w:r>
+                        <w:rPr>
+                          <w:rFonts w:ascii="Poppins" w:hAnsi="Poppins" w:cs="Poppins"/>
+                          <w:noProof/>
+                        </w:rPr>
+                        <w:drawing>
+                          <wp:inline distT="0" distB="0" distL="0" distR="0" wp14:anchorId="42D607F9" wp14:editId="27FCBC1E">
+                            <wp:extent cx="5760720" cy="445135"/>
+                            <wp:effectExtent l="0" t="0" r="0" b="0"/>
+                            <wp:docPr id="1355115818" name="Image 1"/>
+                            <wp:cNvGraphicFramePr>
+                              <a:graphicFrameLocks xmlns:a="http://schemas.openxmlformats.org/drawingml/2006/main" noChangeAspect="1"/>
+                            </wp:cNvGraphicFramePr>
+                            <a:graphic xmlns:a="http://schemas.openxmlformats.org/drawingml/2006/main">
+                              <a:graphicData uri="http://schemas.openxmlformats.org/drawingml/2006/picture">
+                                <pic:pic xmlns:pic="http://schemas.openxmlformats.org/drawingml/2006/picture">
+                                  <pic:nvPicPr>
+                                    <pic:cNvPr id="480231220" name=""/>
+                                    <pic:cNvPicPr/>
+                                  </pic:nvPicPr>
+                                  <pic:blipFill>
+                                    <a:blip r:embed="rId24"/>
+                                    <a:stretch>
+                                      <a:fillRect/>
+                                    </a:stretch>
+                                  </pic:blipFill>
+                                  <pic:spPr>
+                                    <a:xfrm>
+                                      <a:off x="0" y="0"/>
+                                      <a:ext cx="5760720" cy="445135"/>
+                                    </a:xfrm>
+                                    <a:prstGeom prst="rect">
+                                      <a:avLst/>
+                                    </a:prstGeom>
+                                  </pic:spPr>
+                                </pic:pic>
+                              </a:graphicData>
+                            </a:graphic>
+                          </wp:inline>
+                        </w:drawing>
+                      </w:r>
+                    </w:p>
+                  </w:txbxContent>
+                </v:textbox>
+                <w10:wrap type="square" anchorx="margin"/>
+              </v:rect>
+            </w:pict>
+          </mc:Fallback>
+        </mc:AlternateContent>
+      </w:r>
     </w:p>
     <w:p>
       <w:pPr>
@@ -1547,72 +1818,22 @@
       <w:r>
         <w:rPr>
           <w:rFonts w:ascii="Poppins" w:hAnsi="Poppins" w:cs="Poppins"/>
+        </w:rPr>
+        <w:t>Quand vous allez cliquer sur « Acheter », vous pourrez enfin accéder au moteur de recherche comme la capture ci-dessous.</w:t>
+      </w:r>
+    </w:p>
+    <w:p>
+      <w:pPr>
+        <w:jc w:val="both"/>
+        <w:rPr>
+          <w:rFonts w:ascii="Poppins" w:hAnsi="Poppins" w:cs="Poppins"/>
+        </w:rPr>
+      </w:pPr>
+      <w:r>
+        <w:rPr>
+          <w:rFonts w:ascii="Poppins" w:hAnsi="Poppins" w:cs="Poppins"/>
           <w:noProof/>
         </w:rPr>
-        <w:drawing>
-          <wp:inline distT="0" distB="0" distL="0" distR="0" wp14:anchorId="6F03F86A" wp14:editId="55B9E687">
-            <wp:extent cx="5760720" cy="445135"/>
-            <wp:effectExtent l="0" t="0" r="0" b="0"/>
-            <wp:docPr id="480231220" name="Image 1"/>
-            <wp:cNvGraphicFramePr>
-              <a:graphicFrameLocks xmlns:a="http://schemas.openxmlformats.org/drawingml/2006/main" noChangeAspect="1"/>
-            </wp:cNvGraphicFramePr>
-            <a:graphic xmlns:a="http://schemas.openxmlformats.org/drawingml/2006/main">
-              <a:graphicData uri="http://schemas.openxmlformats.org/drawingml/2006/picture">
-                <pic:pic xmlns:pic="http://schemas.openxmlformats.org/drawingml/2006/picture">
-                  <pic:nvPicPr>
-                    <pic:cNvPr id="480231220" name=""/>
-                    <pic:cNvPicPr/>
-                  </pic:nvPicPr>
-                  <pic:blipFill>
-                    <a:blip r:embed="rId23"/>
-                    <a:stretch>
-                      <a:fillRect/>
-                    </a:stretch>
-                  </pic:blipFill>
-                  <pic:spPr>
-                    <a:xfrm>
-                      <a:off x="0" y="0"/>
-                      <a:ext cx="5760720" cy="445135"/>
-                    </a:xfrm>
-                    <a:prstGeom prst="rect">
-                      <a:avLst/>
-                    </a:prstGeom>
-                  </pic:spPr>
-                </pic:pic>
-              </a:graphicData>
-            </a:graphic>
-          </wp:inline>
-        </w:drawing>
-      </w:r>
-    </w:p>
-    <w:p>
-      <w:pPr>
-        <w:jc w:val="both"/>
-        <w:rPr>
-          <w:rFonts w:ascii="Poppins" w:hAnsi="Poppins" w:cs="Poppins"/>
-        </w:rPr>
-      </w:pPr>
-      <w:r>
-        <w:rPr>
-          <w:rFonts w:ascii="Poppins" w:hAnsi="Poppins" w:cs="Poppins"/>
-        </w:rPr>
-        <w:t>Quand vous allez cliquer sur « Acheter », vous pourrez enfin accéder au moteur de recherche comme la capture ci-dessous.</w:t>
-      </w:r>
-    </w:p>
-    <w:p>
-      <w:pPr>
-        <w:jc w:val="both"/>
-        <w:rPr>
-          <w:rFonts w:ascii="Poppins" w:hAnsi="Poppins" w:cs="Poppins"/>
-        </w:rPr>
-      </w:pPr>
-      <w:r>
-        <w:rPr>
-          <w:rFonts w:ascii="Poppins" w:hAnsi="Poppins" w:cs="Poppins"/>
-          <w:noProof/>
-        </w:rPr>
-        <w:lastRenderedPageBreak/>
         <w:drawing>
           <wp:inline distT="0" distB="0" distL="0" distR="0" wp14:anchorId="77C709EC" wp14:editId="1590E5AF">
             <wp:extent cx="5553075" cy="752475"/>
@@ -1629,7 +1850,7 @@
                     <pic:cNvPicPr/>
                   </pic:nvPicPr>
                   <pic:blipFill>
-                    <a:blip r:embed="rId24"/>
+                    <a:blip r:embed="rId26"/>
                     <a:stretch>
                       <a:fillRect/>
                     </a:stretch>
@@ -1658,7 +1879,7 @@
           <w:rFonts w:ascii="Poppins" w:hAnsi="Poppins" w:cs="Poppins"/>
         </w:rPr>
       </w:pPr>
-      <w:bookmarkStart w:id="3" w:name="_Toc223260743"/>
+      <w:bookmarkStart w:id="3" w:name="_Toc223463731"/>
       <w:r>
         <w:rPr>
           <w:rFonts w:ascii="Poppins" w:hAnsi="Poppins" w:cs="Poppins"/>
@@ -1692,23 +1913,32 @@
         <w:rPr>
           <w:rFonts w:ascii="Poppins" w:hAnsi="Poppins" w:cs="Poppins"/>
         </w:rPr>
-        <w:t xml:space="preserve">ce projet dans </w:t>
-      </w:r>
-      <w:proofErr w:type="spellStart"/>
-      <w:r>
-        <w:rPr>
-          <w:rFonts w:ascii="Poppins" w:hAnsi="Poppins" w:cs="Poppins"/>
-        </w:rPr>
-        <w:t>Meilisearch</w:t>
-      </w:r>
-      <w:proofErr w:type="spellEnd"/>
+        <w:t>ce projet</w:t>
+      </w:r>
+      <w:r>
+        <w:rPr>
+          <w:rFonts w:ascii="Poppins" w:hAnsi="Poppins" w:cs="Poppins"/>
+        </w:rPr>
+        <w:t>,</w:t>
+      </w:r>
+      <w:r>
+        <w:rPr>
+          <w:rFonts w:ascii="Poppins" w:hAnsi="Poppins" w:cs="Poppins"/>
+        </w:rPr>
+        <w:t xml:space="preserve"> dans Meilisearch</w:t>
+      </w:r>
+      <w:r>
+        <w:rPr>
+          <w:rFonts w:ascii="Poppins" w:hAnsi="Poppins" w:cs="Poppins"/>
+        </w:rPr>
+        <w:t>,</w:t>
+      </w:r>
       <w:r>
         <w:rPr>
           <w:rFonts w:ascii="Poppins" w:hAnsi="Poppins" w:cs="Poppins"/>
         </w:rPr>
         <w:t xml:space="preserve"> </w:t>
       </w:r>
-      <w:proofErr w:type="gramStart"/>
       <w:r>
         <w:rPr>
           <w:rFonts w:ascii="Poppins" w:hAnsi="Poppins" w:cs="Poppins"/>
@@ -1721,7 +1951,6 @@
         </w:rPr>
         <w:t xml:space="preserve"> à ce</w:t>
       </w:r>
-      <w:proofErr w:type="gramEnd"/>
       <w:r>
         <w:rPr>
           <w:rFonts w:ascii="Poppins" w:hAnsi="Poppins" w:cs="Poppins"/>
@@ -1754,12 +1983,24 @@
         <w:rPr>
           <w:rFonts w:ascii="Poppins" w:hAnsi="Poppins" w:cs="Poppins"/>
         </w:rPr>
-        <w:t>Rendez-vous sur la page d’accueil de notre application, en cliquant sur le logo de notre application.</w:t>
-      </w:r>
-    </w:p>
-    <w:p>
-      <w:pPr>
-        <w:jc w:val="both"/>
+        <w:t xml:space="preserve">Rendez-vous sur la page d’accueil de notre application, en cliquant sur le logo de notre </w:t>
+      </w:r>
+      <w:r>
+        <w:rPr>
+          <w:rFonts w:ascii="Poppins" w:hAnsi="Poppins" w:cs="Poppins"/>
+        </w:rPr>
+        <w:t>site d’enchère</w:t>
+      </w:r>
+      <w:r>
+        <w:rPr>
+          <w:rFonts w:ascii="Poppins" w:hAnsi="Poppins" w:cs="Poppins"/>
+        </w:rPr>
+        <w:t>.</w:t>
+      </w:r>
+    </w:p>
+    <w:p>
+      <w:pPr>
+        <w:jc w:val="center"/>
         <w:rPr>
           <w:rFonts w:ascii="Poppins" w:hAnsi="Poppins" w:cs="Poppins"/>
         </w:rPr>
@@ -1785,7 +2026,7 @@
                     <pic:cNvPicPr/>
                   </pic:nvPicPr>
                   <pic:blipFill>
-                    <a:blip r:embed="rId25"/>
+                    <a:blip r:embed="rId27"/>
                     <a:stretch>
                       <a:fillRect/>
                     </a:stretch>
@@ -1822,7 +2063,7 @@
     </w:p>
     <w:p>
       <w:pPr>
-        <w:jc w:val="both"/>
+        <w:jc w:val="center"/>
         <w:rPr>
           <w:rFonts w:ascii="Poppins" w:hAnsi="Poppins" w:cs="Poppins"/>
         </w:rPr>
@@ -1848,7 +2089,7 @@
                     <pic:cNvPicPr/>
                   </pic:nvPicPr>
                   <pic:blipFill>
-                    <a:blip r:embed="rId26"/>
+                    <a:blip r:embed="rId28"/>
                     <a:stretch>
                       <a:fillRect/>
                     </a:stretch>
@@ -1880,6 +2121,7 @@
         <w:rPr>
           <w:rFonts w:ascii="Poppins" w:hAnsi="Poppins" w:cs="Poppins"/>
         </w:rPr>
+        <w:lastRenderedPageBreak/>
         <w:t>Modifie</w:t>
       </w:r>
       <w:r>
@@ -1897,7 +2139,7 @@
     </w:p>
     <w:p>
       <w:pPr>
-        <w:jc w:val="both"/>
+        <w:jc w:val="center"/>
         <w:rPr>
           <w:rFonts w:ascii="Poppins" w:hAnsi="Poppins" w:cs="Poppins"/>
         </w:rPr>
@@ -1923,7 +2165,7 @@
                     <pic:cNvPicPr/>
                   </pic:nvPicPr>
                   <pic:blipFill>
-                    <a:blip r:embed="rId27"/>
+                    <a:blip r:embed="rId29"/>
                     <a:stretch>
                       <a:fillRect/>
                     </a:stretch>
@@ -1955,12 +2197,24 @@
         <w:rPr>
           <w:rFonts w:ascii="Poppins" w:hAnsi="Poppins" w:cs="Poppins"/>
         </w:rPr>
-        <w:t>Parmi tous les fichiers, cherchez celui-ci :</w:t>
-      </w:r>
-    </w:p>
-    <w:p>
-      <w:pPr>
-        <w:jc w:val="both"/>
+        <w:t xml:space="preserve">Parmi tous les fichiers, </w:t>
+      </w:r>
+      <w:r>
+        <w:rPr>
+          <w:rFonts w:ascii="Poppins" w:hAnsi="Poppins" w:cs="Poppins"/>
+        </w:rPr>
+        <w:t>re</w:t>
+      </w:r>
+      <w:r>
+        <w:rPr>
+          <w:rFonts w:ascii="Poppins" w:hAnsi="Poppins" w:cs="Poppins"/>
+        </w:rPr>
+        <w:t>cherchez celui-ci :</w:t>
+      </w:r>
+    </w:p>
+    <w:p>
+      <w:pPr>
+        <w:jc w:val="center"/>
         <w:rPr>
           <w:rFonts w:ascii="Poppins" w:hAnsi="Poppins" w:cs="Poppins"/>
         </w:rPr>
@@ -1986,7 +2240,7 @@
                     <pic:cNvPicPr/>
                   </pic:nvPicPr>
                   <pic:blipFill>
-                    <a:blip r:embed="rId28"/>
+                    <a:blip r:embed="rId30"/>
                     <a:stretch>
                       <a:fillRect/>
                     </a:stretch>
@@ -2023,7 +2277,7 @@
     </w:p>
     <w:p>
       <w:pPr>
-        <w:jc w:val="both"/>
+        <w:jc w:val="center"/>
         <w:rPr>
           <w:rFonts w:ascii="Poppins" w:hAnsi="Poppins" w:cs="Poppins"/>
         </w:rPr>
@@ -2049,7 +2303,7 @@
                     <pic:cNvPicPr/>
                   </pic:nvPicPr>
                   <pic:blipFill>
-                    <a:blip r:embed="rId29"/>
+                    <a:blip r:embed="rId31"/>
                     <a:stretch>
                       <a:fillRect/>
                     </a:stretch>
@@ -2091,29 +2345,213 @@
           <w:rFonts w:ascii="Poppins" w:hAnsi="Poppins" w:cs="Poppins"/>
         </w:rPr>
       </w:pPr>
-    </w:p>
-    <w:p>
-      <w:pPr>
-        <w:jc w:val="both"/>
-        <w:rPr>
-          <w:rFonts w:ascii="Poppins" w:hAnsi="Poppins" w:cs="Poppins"/>
-        </w:rPr>
-      </w:pPr>
-      <w:r>
-        <w:rPr>
-          <w:rFonts w:ascii="Poppins" w:hAnsi="Poppins" w:cs="Poppins"/>
-        </w:rPr>
-        <w:t xml:space="preserve">Attention : pour utiliser cette fonctionnalité vous devez avoir activer au préalable le moteur de recherche via la section précédente : </w:t>
-      </w:r>
-      <w:hyperlink w:anchor="_Activation" w:history="1">
-        <w:r>
-          <w:rPr>
-            <w:rStyle w:val="Lienhypertexte"/>
-            <w:rFonts w:ascii="Poppins" w:hAnsi="Poppins" w:cs="Poppins"/>
-          </w:rPr>
-          <w:t>cliquez ici</w:t>
-        </w:r>
-      </w:hyperlink>
+      <w:r>
+        <w:rPr>
+          <w:noProof/>
+          <w:lang w:eastAsia="fr-FR"/>
+        </w:rPr>
+        <mc:AlternateContent>
+          <mc:Choice Requires="wps">
+            <w:drawing>
+              <wp:anchor distT="0" distB="0" distL="114300" distR="114300" simplePos="0" relativeHeight="251663360" behindDoc="1" locked="0" layoutInCell="1" allowOverlap="1" wp14:anchorId="67F7176B" wp14:editId="70277ACB">
+                <wp:simplePos x="0" y="0"/>
+                <wp:positionH relativeFrom="margin">
+                  <wp:align>center</wp:align>
+                </wp:positionH>
+                <wp:positionV relativeFrom="paragraph">
+                  <wp:posOffset>270345</wp:posOffset>
+                </wp:positionV>
+                <wp:extent cx="6838950" cy="1359535"/>
+                <wp:effectExtent l="0" t="0" r="19050" b="12065"/>
+                <wp:wrapSquare wrapText="bothSides"/>
+                <wp:docPr id="1094550507" name="Rectangle 5"/>
+                <wp:cNvGraphicFramePr/>
+                <a:graphic xmlns:a="http://schemas.openxmlformats.org/drawingml/2006/main">
+                  <a:graphicData uri="http://schemas.microsoft.com/office/word/2010/wordprocessingShape">
+                    <wps:wsp>
+                      <wps:cNvSpPr/>
+                      <wps:spPr>
+                        <a:xfrm>
+                          <a:off x="0" y="0"/>
+                          <a:ext cx="6838950" cy="1359673"/>
+                        </a:xfrm>
+                        <a:prstGeom prst="rect">
+                          <a:avLst/>
+                        </a:prstGeom>
+                        <a:noFill/>
+                        <a:ln>
+                          <a:solidFill>
+                            <a:srgbClr val="C00000"/>
+                          </a:solidFill>
+                        </a:ln>
+                      </wps:spPr>
+                      <wps:style>
+                        <a:lnRef idx="2">
+                          <a:schemeClr val="accent1">
+                            <a:shade val="15000"/>
+                          </a:schemeClr>
+                        </a:lnRef>
+                        <a:fillRef idx="1">
+                          <a:schemeClr val="accent1"/>
+                        </a:fillRef>
+                        <a:effectRef idx="0">
+                          <a:schemeClr val="accent1"/>
+                        </a:effectRef>
+                        <a:fontRef idx="minor">
+                          <a:schemeClr val="lt1"/>
+                        </a:fontRef>
+                      </wps:style>
+                      <wps:txbx>
+                        <w:txbxContent>
+                          <w:p>
+                            <w:pPr>
+                              <w:jc w:val="center"/>
+                              <w:rPr>
+                                <w:rFonts w:ascii="Poppins" w:hAnsi="Poppins" w:cs="Poppins"/>
+                                <w:b/>
+                                <w:bCs/>
+                                <w:color w:val="EE0000"/>
+                                <w:sz w:val="44"/>
+                                <w:szCs w:val="44"/>
+                              </w:rPr>
+                            </w:pPr>
+                            <w:r>
+                              <w:rPr>
+                                <w:rFonts w:ascii="Poppins" w:hAnsi="Poppins" w:cs="Poppins"/>
+                                <w:b/>
+                                <w:bCs/>
+                                <w:color w:val="EE0000"/>
+                                <w:sz w:val="44"/>
+                                <w:szCs w:val="44"/>
+                              </w:rPr>
+                              <w:t>Attention</w:t>
+                            </w:r>
+                          </w:p>
+                          <w:p>
+                            <w:pPr>
+                              <w:jc w:val="center"/>
+                              <w:rPr>
+                                <w:rFonts w:ascii="Poppins" w:hAnsi="Poppins" w:cs="Poppins"/>
+                              </w:rPr>
+                            </w:pPr>
+                            <w:r>
+                              <w:rPr>
+                                <w:rFonts w:ascii="Poppins" w:hAnsi="Poppins" w:cs="Poppins"/>
+                              </w:rPr>
+                              <w:t>Pour</w:t>
+                            </w:r>
+                            <w:r>
+                              <w:rPr>
+                                <w:rFonts w:ascii="Poppins" w:hAnsi="Poppins" w:cs="Poppins"/>
+                              </w:rPr>
+                              <w:t xml:space="preserve"> utiliser cette fonctionnalité vous devez avoir activer au préalable le moteur de recherche via la section précédente : </w:t>
+                            </w:r>
+                            <w:hyperlink w:anchor="_Activation" w:history="1">
+                              <w:r>
+                                <w:rPr>
+                                  <w:rStyle w:val="Lienhypertexte"/>
+                                  <w:rFonts w:ascii="Poppins" w:hAnsi="Poppins" w:cs="Poppins"/>
+                                </w:rPr>
+                                <w:t>cliquez ici</w:t>
+                              </w:r>
+                            </w:hyperlink>
+                          </w:p>
+                          <w:p>
+                            <w:pPr>
+                              <w:jc w:val="center"/>
+                            </w:pPr>
+                          </w:p>
+                        </w:txbxContent>
+                      </wps:txbx>
+                      <wps:bodyPr rot="0" spcFirstLastPara="0" vertOverflow="clip" horzOverflow="clip" vert="horz" wrap="square" lIns="91440" tIns="45720" rIns="91440" bIns="45720" numCol="1" spcCol="0" rtlCol="0" fromWordArt="0" anchor="ctr" anchorCtr="0" forceAA="0" compatLnSpc="1">
+                        <a:prstTxWarp prst="textNoShape">
+                          <a:avLst/>
+                        </a:prstTxWarp>
+                        <a:noAutofit/>
+                      </wps:bodyPr>
+                    </wps:wsp>
+                  </a:graphicData>
+                </a:graphic>
+                <wp14:sizeRelH relativeFrom="page">
+                  <wp14:pctWidth>0</wp14:pctWidth>
+                </wp14:sizeRelH>
+                <wp14:sizeRelV relativeFrom="margin">
+                  <wp14:pctHeight>0</wp14:pctHeight>
+                </wp14:sizeRelV>
+              </wp:anchor>
+            </w:drawing>
+          </mc:Choice>
+          <mc:Fallback>
+            <w:pict>
+              <v:rect w14:anchorId="67F7176B" id="_x0000_s1027" style="position:absolute;left:0;text-align:left;margin-left:0;margin-top:21.3pt;width:538.5pt;height:107.05pt;z-index:-251653120;visibility:visible;mso-wrap-style:square;mso-width-percent:0;mso-height-percent:0;mso-wrap-distance-left:9pt;mso-wrap-distance-top:0;mso-wrap-distance-right:9pt;mso-wrap-distance-bottom:0;mso-position-horizontal:center;mso-position-horizontal-relative:margin;mso-position-vertical:absolute;mso-position-vertical-relative:text;mso-width-percent:0;mso-height-percent:0;mso-width-relative:page;mso-height-relative:margin;v-text-anchor:middle" o:gfxdata="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" filled="f" strokecolor="#c00000" strokeweight="1pt">
+                <v:textbox>
+                  <w:txbxContent>
+                    <w:p>
+                      <w:pPr>
+                        <w:jc w:val="center"/>
+                        <w:rPr>
+                          <w:rFonts w:ascii="Poppins" w:hAnsi="Poppins" w:cs="Poppins"/>
+                          <w:b/>
+                          <w:bCs/>
+                          <w:color w:val="EE0000"/>
+                          <w:sz w:val="44"/>
+                          <w:szCs w:val="44"/>
+                        </w:rPr>
+                      </w:pPr>
+                      <w:r>
+                        <w:rPr>
+                          <w:rFonts w:ascii="Poppins" w:hAnsi="Poppins" w:cs="Poppins"/>
+                          <w:b/>
+                          <w:bCs/>
+                          <w:color w:val="EE0000"/>
+                          <w:sz w:val="44"/>
+                          <w:szCs w:val="44"/>
+                        </w:rPr>
+                        <w:t>Attention</w:t>
+                      </w:r>
+                    </w:p>
+                    <w:p>
+                      <w:pPr>
+                        <w:jc w:val="center"/>
+                        <w:rPr>
+                          <w:rFonts w:ascii="Poppins" w:hAnsi="Poppins" w:cs="Poppins"/>
+                        </w:rPr>
+                      </w:pPr>
+                      <w:r>
+                        <w:rPr>
+                          <w:rFonts w:ascii="Poppins" w:hAnsi="Poppins" w:cs="Poppins"/>
+                        </w:rPr>
+                        <w:t>Pour</w:t>
+                      </w:r>
+                      <w:r>
+                        <w:rPr>
+                          <w:rFonts w:ascii="Poppins" w:hAnsi="Poppins" w:cs="Poppins"/>
+                        </w:rPr>
+                        <w:t xml:space="preserve"> utiliser cette fonctionnalité vous devez avoir activer au préalable le moteur de recherche via la section précédente : </w:t>
+                      </w:r>
+                      <w:hyperlink w:anchor="_Activation" w:history="1">
+                        <w:r>
+                          <w:rPr>
+                            <w:rStyle w:val="Lienhypertexte"/>
+                            <w:rFonts w:ascii="Poppins" w:hAnsi="Poppins" w:cs="Poppins"/>
+                          </w:rPr>
+                          <w:t>cliquez ici</w:t>
+                        </w:r>
+                      </w:hyperlink>
+                    </w:p>
+                    <w:p>
+                      <w:pPr>
+                        <w:jc w:val="center"/>
+                      </w:pPr>
+                    </w:p>
+                  </w:txbxContent>
+                </v:textbox>
+                <w10:wrap type="square" anchorx="margin"/>
+              </v:rect>
+            </w:pict>
+          </mc:Fallback>
+        </mc:AlternateContent>
+      </w:r>
     </w:p>
     <w:p>
       <w:pPr>
@@ -2516,6 +2954,154 @@
           </w:p>
         </w:tc>
       </w:tr>
+      <w:tr>
+        <w:trPr>
+          <w:trHeight w:val="300"/>
+        </w:trPr>
+        <w:tc>
+          <w:tcPr>
+            <w:tcW w:w="1049" w:type="dxa"/>
+            <w:tcBorders>
+              <w:top w:val="single" w:sz="6" w:space="0" w:color="auto"/>
+              <w:left w:val="single" w:sz="6" w:space="0" w:color="auto"/>
+              <w:bottom w:val="single" w:sz="6" w:space="0" w:color="auto"/>
+              <w:right w:val="single" w:sz="6" w:space="0" w:color="auto"/>
+            </w:tcBorders>
+          </w:tcPr>
+          <w:p>
+            <w:pPr>
+              <w:jc w:val="both"/>
+              <w:rPr>
+                <w:rFonts w:ascii="Poppins" w:hAnsi="Poppins" w:cs="Poppins"/>
+              </w:rPr>
+            </w:pPr>
+            <w:r>
+              <w:rPr>
+                <w:rFonts w:ascii="Poppins" w:hAnsi="Poppins" w:cs="Poppins"/>
+              </w:rPr>
+              <w:t>V</w:t>
+            </w:r>
+            <w:r>
+              <w:rPr>
+                <w:rFonts w:ascii="Poppins" w:hAnsi="Poppins" w:cs="Poppins"/>
+              </w:rPr>
+              <w:t>2</w:t>
+            </w:r>
+          </w:p>
+        </w:tc>
+        <w:tc>
+          <w:tcPr>
+            <w:tcW w:w="1388" w:type="dxa"/>
+            <w:tcBorders>
+              <w:top w:val="single" w:sz="6" w:space="0" w:color="auto"/>
+              <w:left w:val="single" w:sz="6" w:space="0" w:color="auto"/>
+              <w:bottom w:val="single" w:sz="6" w:space="0" w:color="auto"/>
+              <w:right w:val="single" w:sz="6" w:space="0" w:color="auto"/>
+            </w:tcBorders>
+          </w:tcPr>
+          <w:p>
+            <w:pPr>
+              <w:jc w:val="both"/>
+              <w:rPr>
+                <w:rFonts w:ascii="Poppins" w:hAnsi="Poppins" w:cs="Poppins"/>
+              </w:rPr>
+            </w:pPr>
+            <w:r>
+              <w:rPr>
+                <w:rFonts w:ascii="Poppins" w:hAnsi="Poppins" w:cs="Poppins"/>
+              </w:rPr>
+              <w:t>3</w:t>
+            </w:r>
+            <w:r>
+              <w:rPr>
+                <w:rFonts w:ascii="Poppins" w:hAnsi="Poppins" w:cs="Poppins"/>
+              </w:rPr>
+              <w:t>/03/2026</w:t>
+            </w:r>
+          </w:p>
+        </w:tc>
+        <w:tc>
+          <w:tcPr>
+            <w:tcW w:w="1569" w:type="dxa"/>
+            <w:tcBorders>
+              <w:top w:val="single" w:sz="6" w:space="0" w:color="auto"/>
+              <w:left w:val="single" w:sz="6" w:space="0" w:color="auto"/>
+              <w:bottom w:val="single" w:sz="6" w:space="0" w:color="auto"/>
+              <w:right w:val="single" w:sz="6" w:space="0" w:color="auto"/>
+            </w:tcBorders>
+          </w:tcPr>
+          <w:p>
+            <w:pPr>
+              <w:jc w:val="both"/>
+              <w:rPr>
+                <w:rFonts w:ascii="Poppins" w:hAnsi="Poppins" w:cs="Poppins"/>
+              </w:rPr>
+            </w:pPr>
+            <w:r>
+              <w:rPr>
+                <w:rFonts w:ascii="Poppins" w:hAnsi="Poppins" w:cs="Poppins"/>
+              </w:rPr>
+              <w:t>GARNIER J. </w:t>
+            </w:r>
+          </w:p>
+        </w:tc>
+        <w:tc>
+          <w:tcPr>
+            <w:tcW w:w="1565" w:type="dxa"/>
+            <w:tcBorders>
+              <w:top w:val="single" w:sz="6" w:space="0" w:color="auto"/>
+              <w:left w:val="single" w:sz="6" w:space="0" w:color="auto"/>
+              <w:bottom w:val="single" w:sz="6" w:space="0" w:color="auto"/>
+              <w:right w:val="single" w:sz="6" w:space="0" w:color="auto"/>
+            </w:tcBorders>
+          </w:tcPr>
+          <w:p>
+            <w:pPr>
+              <w:jc w:val="both"/>
+              <w:rPr>
+                <w:rFonts w:ascii="Poppins" w:hAnsi="Poppins" w:cs="Poppins"/>
+              </w:rPr>
+            </w:pPr>
+            <w:r>
+              <w:rPr>
+                <w:rFonts w:ascii="Poppins" w:hAnsi="Poppins" w:cs="Poppins"/>
+              </w:rPr>
+              <w:t> </w:t>
+            </w:r>
+          </w:p>
+        </w:tc>
+        <w:tc>
+          <w:tcPr>
+            <w:tcW w:w="3485" w:type="dxa"/>
+            <w:tcBorders>
+              <w:top w:val="single" w:sz="6" w:space="0" w:color="auto"/>
+              <w:left w:val="single" w:sz="6" w:space="0" w:color="auto"/>
+              <w:bottom w:val="single" w:sz="6" w:space="0" w:color="auto"/>
+              <w:right w:val="single" w:sz="6" w:space="0" w:color="auto"/>
+            </w:tcBorders>
+          </w:tcPr>
+          <w:p>
+            <w:pPr>
+              <w:jc w:val="both"/>
+              <w:rPr>
+                <w:rFonts w:ascii="Poppins" w:hAnsi="Poppins" w:cs="Poppins"/>
+              </w:rPr>
+            </w:pPr>
+            <w:r>
+              <w:rPr>
+                <w:rFonts w:ascii="Poppins" w:hAnsi="Poppins" w:cs="Poppins"/>
+              </w:rPr>
+              <w:t>Ajout de quelques détails supplémentaires</w:t>
+            </w:r>
+            <w:r>
+              <w:rPr>
+                <w:rFonts w:ascii="Poppins" w:hAnsi="Poppins" w:cs="Poppins"/>
+              </w:rPr>
+              <w:t> </w:t>
+            </w:r>
+          </w:p>
+        </w:tc>
+      </w:tr>
     </w:tbl>
     <w:p>
       <w:pPr>
@@ -2526,7 +3112,7 @@
       </w:pPr>
     </w:p>
     <w:sectPr>
-      <w:footerReference w:type="default" r:id="rId30"/>
+      <w:footerReference w:type="default" r:id="rId32"/>
       <w:pgSz w:w="11906" w:h="16838"/>
       <w:pgMar w:top="1417" w:right="1417" w:bottom="1417" w:left="1417" w:header="708" w:footer="708" w:gutter="0"/>
       <w:cols w:space="708"/>
@@ -2698,6 +3284,126 @@
     </w:p>
   </w:footnote>
 </w:footnotes>
+</file>
+
+<file path=word/numbering.xml><?xml version="1.0" encoding="utf-8"?>
+<w:numbering xmlns:wpc="http://schemas.microsoft.com/office/word/2010/wordprocessingCanvas" xmlns:cx="http://schemas.microsoft.com/office/drawing/2014/chartex" xmlns:cx1="http://schemas.microsoft.com/office/drawing/2015/9/8/chartex" xmlns:cx2="http://schemas.microsoft.com/office/drawing/2015/10/21/chartex" xmlns:cx3="http://schemas.microsoft.com/office/drawing/2016/5/9/chartex" xmlns:cx4="http://schemas.microsoft.com/office/drawing/2016/5/10/chartex" xmlns:cx5="http://schemas.microsoft.com/office/drawing/2016/5/11/chartex" xmlns:cx6="http://schemas.microsoft.com/office/drawing/2016/5/12/chartex" xmlns:cx7="http://schemas.microsoft.com/office/drawing/2016/5/13/chartex" xmlns:cx8="http://schemas.microsoft.com/office/drawing/2016/5/14/chartex" xmlns:mc="http://schemas.openxmlformats.org/markup-compatibility/2006" xmlns:aink="http://schemas.microsoft.com/office/drawing/2016/ink" xmlns:am3d="http://schemas.microsoft.com/office/drawing/2017/model3d" xmlns:o="urn:schemas-microsoft-com:office:office" xmlns:oel="http://schemas.microsoft.com/office/2019/extlst" xmlns:r="http://schemas.openxmlformats.org/officeDocument/2006/relationships" xmlns:m="http://schemas.openxmlformats.org/officeDocument/2006/math" xmlns:v="urn:schemas-microsoft-com:vml" xmlns:wp14="http://schemas.microsoft.com/office/word/2010/wordprocessingDrawing" xmlns:wp="http://schemas.openxmlformats.org/drawingml/2006/wordprocessingDrawing" xmlns:w10="urn:schemas-microsoft-com:office:word" xmlns:w="http://schemas.openxmlformats.org/wordprocessingml/2006/main" xmlns:w14="http://schemas.microsoft.com/office/word/2010/wordml" xmlns:w15="http://schemas.microsoft.com/office/word/2012/wordml" xmlns:w16cex="http://schemas.microsoft.com/office/word/2018/wordml/cex" xmlns:w16cid="http://schemas.microsoft.com/office/word/2016/wordml/cid" xmlns:w16="http://schemas.microsoft.com/office/word/2018/wordml" xmlns:w16du="http://schemas.microsoft.com/office/word/2023/wordml/word16du" xmlns:w16sdtdh="http://schemas.microsoft.com/office/word/2020/wordml/sdtdatahash" xmlns:w16sdtfl="http://schemas.microsoft.com/office/word/2024/wordml/sdtformatlock" xmlns:w16se="http://schemas.microsoft.com/office/word/2015/wordml/symex" xmlns:wpg="http://schemas.microsoft.com/office/word/2010/wordprocessingGroup" xmlns:wpi="http://schemas.microsoft.com/office/word/2010/wordprocessingInk" xmlns:wne="http://schemas.microsoft.com/office/word/2006/wordml" xmlns:wps="http://schemas.microsoft.com/office/word/2010/wordprocessingShape" mc:Ignorable="w14 w15 w16se w16cid w16 w16cex w16sdtdh w16sdtfl w16du wp14">
+  <w:abstractNum w:abstractNumId="0" w15:restartNumberingAfterBreak="0">
+    <w:nsid w:val="5562513E"/>
+    <w:multiLevelType w:val="hybridMultilevel"/>
+    <w:tmpl w:val="B752782C"/>
+    <w:lvl w:ilvl="0" w:tplc="BC9E9C90">
+      <w:numFmt w:val="bullet"/>
+      <w:lvlText w:val="-"/>
+      <w:lvlJc w:val="left"/>
+      <w:pPr>
+        <w:ind w:left="720" w:hanging="360"/>
+      </w:pPr>
+      <w:rPr>
+        <w:rFonts w:ascii="Aptos" w:eastAsiaTheme="minorHAnsi" w:hAnsi="Aptos" w:cstheme="minorBidi" w:hint="default"/>
+      </w:rPr>
+    </w:lvl>
+    <w:lvl w:ilvl="1" w:tplc="040C0003">
+      <w:start w:val="1"/>
+      <w:numFmt w:val="bullet"/>
+      <w:lvlText w:val="o"/>
+      <w:lvlJc w:val="left"/>
+      <w:pPr>
+        <w:ind w:left="1440" w:hanging="360"/>
+      </w:pPr>
+      <w:rPr>
+        <w:rFonts w:ascii="Courier New" w:hAnsi="Courier New" w:cs="Courier New" w:hint="default"/>
+      </w:rPr>
+    </w:lvl>
+    <w:lvl w:ilvl="2" w:tplc="040C0005" w:tentative="1">
+      <w:start w:val="1"/>
+      <w:numFmt w:val="bullet"/>
+      <w:lvlText w:val=""/>
+      <w:lvlJc w:val="left"/>
+      <w:pPr>
+        <w:ind w:left="2160" w:hanging="360"/>
+      </w:pPr>
+      <w:rPr>
+        <w:rFonts w:ascii="Wingdings" w:hAnsi="Wingdings" w:hint="default"/>
+      </w:rPr>
+    </w:lvl>
+    <w:lvl w:ilvl="3" w:tplc="040C0001" w:tentative="1">
+      <w:start w:val="1"/>
+      <w:numFmt w:val="bullet"/>
+      <w:lvlText w:val=""/>
+      <w:lvlJc w:val="left"/>
+      <w:pPr>
+        <w:ind w:left="2880" w:hanging="360"/>
+      </w:pPr>
+      <w:rPr>
+        <w:rFonts w:ascii="Symbol" w:hAnsi="Symbol" w:hint="default"/>
+      </w:rPr>
+    </w:lvl>
+    <w:lvl w:ilvl="4" w:tplc="040C0003" w:tentative="1">
+      <w:start w:val="1"/>
+      <w:numFmt w:val="bullet"/>
+      <w:lvlText w:val="o"/>
+      <w:lvlJc w:val="left"/>
+      <w:pPr>
+        <w:ind w:left="3600" w:hanging="360"/>
+      </w:pPr>
+      <w:rPr>
+        <w:rFonts w:ascii="Courier New" w:hAnsi="Courier New" w:cs="Courier New" w:hint="default"/>
+      </w:rPr>
+    </w:lvl>
+    <w:lvl w:ilvl="5" w:tplc="040C0005" w:tentative="1">
+      <w:start w:val="1"/>
+      <w:numFmt w:val="bullet"/>
+      <w:lvlText w:val=""/>
+      <w:lvlJc w:val="left"/>
+      <w:pPr>
+        <w:ind w:left="4320" w:hanging="360"/>
+      </w:pPr>
+      <w:rPr>
+        <w:rFonts w:ascii="Wingdings" w:hAnsi="Wingdings" w:hint="default"/>
+      </w:rPr>
+    </w:lvl>
+    <w:lvl w:ilvl="6" w:tplc="040C0001" w:tentative="1">
+      <w:start w:val="1"/>
+      <w:numFmt w:val="bullet"/>
+      <w:lvlText w:val=""/>
+      <w:lvlJc w:val="left"/>
+      <w:pPr>
+        <w:ind w:left="5040" w:hanging="360"/>
+      </w:pPr>
+      <w:rPr>
+        <w:rFonts w:ascii="Symbol" w:hAnsi="Symbol" w:hint="default"/>
+      </w:rPr>
+    </w:lvl>
+    <w:lvl w:ilvl="7" w:tplc="040C0003" w:tentative="1">
+      <w:start w:val="1"/>
+      <w:numFmt w:val="bullet"/>
+      <w:lvlText w:val="o"/>
+      <w:lvlJc w:val="left"/>
+      <w:pPr>
+        <w:ind w:left="5760" w:hanging="360"/>
+      </w:pPr>
+      <w:rPr>
+        <w:rFonts w:ascii="Courier New" w:hAnsi="Courier New" w:cs="Courier New" w:hint="default"/>
+      </w:rPr>
+    </w:lvl>
+    <w:lvl w:ilvl="8" w:tplc="040C0005" w:tentative="1">
+      <w:start w:val="1"/>
+      <w:numFmt w:val="bullet"/>
+      <w:lvlText w:val=""/>
+      <w:lvlJc w:val="left"/>
+      <w:pPr>
+        <w:ind w:left="6480" w:hanging="360"/>
+      </w:pPr>
+      <w:rPr>
+        <w:rFonts w:ascii="Wingdings" w:hAnsi="Wingdings" w:hint="default"/>
+      </w:rPr>
+    </w:lvl>
+  </w:abstractNum>
+  <w:num w:numId="1" w16cid:durableId="705644697">
+    <w:abstractNumId w:val="0"/>
+  </w:num>
+</w:numbering>
 </file>
 
 <file path=word/styles.xml><?xml version="1.0" encoding="utf-8"?>

</xml_diff>